<commit_message>
Edited Employee names and Added Employee Reference Data
</commit_message>
<xml_diff>
--- a/STRH HRIS TOR.docx
+++ b/STRH HRIS TOR.docx
@@ -1,6 +1,6 @@
 
 <file path=word/document.xml><?xml version="1.0" encoding="utf-8"?>
-<w:document xmlns:wpc="http://schemas.microsoft.com/office/word/2010/wordprocessingCanvas" xmlns:cx="http://schemas.microsoft.com/office/drawing/2014/chartex" xmlns:mc="http://schemas.openxmlformats.org/markup-compatibility/2006" xmlns:o="urn:schemas-microsoft-com:office:office" xmlns:r="http://schemas.openxmlformats.org/officeDocument/2006/relationships" xmlns:m="http://schemas.openxmlformats.org/officeDocument/2006/math" xmlns:v="urn:schemas-microsoft-com:vml" xmlns:wp14="http://schemas.microsoft.com/office/word/2010/wordprocessingDrawing" xmlns:wp="http://schemas.openxmlformats.org/drawingml/2006/wordprocessingDrawing" xmlns:w10="urn:schemas-microsoft-com:office:word" xmlns:w="http://schemas.openxmlformats.org/wordprocessingml/2006/main" xmlns:w14="http://schemas.microsoft.com/office/word/2010/wordml" xmlns:w15="http://schemas.microsoft.com/office/word/2012/wordml" xmlns:w16se="http://schemas.microsoft.com/office/word/2015/wordml/symex" xmlns:wpg="http://schemas.microsoft.com/office/word/2010/wordprocessingGroup" xmlns:wpi="http://schemas.microsoft.com/office/word/2010/wordprocessingInk" xmlns:wne="http://schemas.microsoft.com/office/word/2006/wordml" xmlns:wps="http://schemas.microsoft.com/office/word/2010/wordprocessingShape" mc:Ignorable="w14 w15 w16se wp14">
+<w:document xmlns:wpc="http://schemas.microsoft.com/office/word/2010/wordprocessingCanvas" xmlns:cx="http://schemas.microsoft.com/office/drawing/2014/chartex" xmlns:cx1="http://schemas.microsoft.com/office/drawing/2015/9/8/chartex" xmlns:cx2="http://schemas.microsoft.com/office/drawing/2015/10/21/chartex" xmlns:cx3="http://schemas.microsoft.com/office/drawing/2016/5/9/chartex" xmlns:cx4="http://schemas.microsoft.com/office/drawing/2016/5/10/chartex" xmlns:cx5="http://schemas.microsoft.com/office/drawing/2016/5/11/chartex" xmlns:cx6="http://schemas.microsoft.com/office/drawing/2016/5/12/chartex" xmlns:cx7="http://schemas.microsoft.com/office/drawing/2016/5/13/chartex" xmlns:cx8="http://schemas.microsoft.com/office/drawing/2016/5/14/chartex" xmlns:mc="http://schemas.openxmlformats.org/markup-compatibility/2006" xmlns:aink="http://schemas.microsoft.com/office/drawing/2016/ink" xmlns:am3d="http://schemas.microsoft.com/office/drawing/2017/model3d" xmlns:o="urn:schemas-microsoft-com:office:office" xmlns:oel="http://schemas.microsoft.com/office/2019/extlst" xmlns:r="http://schemas.openxmlformats.org/officeDocument/2006/relationships" xmlns:m="http://schemas.openxmlformats.org/officeDocument/2006/math" xmlns:v="urn:schemas-microsoft-com:vml" xmlns:wp14="http://schemas.microsoft.com/office/word/2010/wordprocessingDrawing" xmlns:wp="http://schemas.openxmlformats.org/drawingml/2006/wordprocessingDrawing" xmlns:w10="urn:schemas-microsoft-com:office:word" xmlns:w="http://schemas.openxmlformats.org/wordprocessingml/2006/main" xmlns:w14="http://schemas.microsoft.com/office/word/2010/wordml" xmlns:w15="http://schemas.microsoft.com/office/word/2012/wordml" xmlns:w16cex="http://schemas.microsoft.com/office/word/2018/wordml/cex" xmlns:w16cid="http://schemas.microsoft.com/office/word/2016/wordml/cid" xmlns:w16="http://schemas.microsoft.com/office/word/2018/wordml" xmlns:w16du="http://schemas.microsoft.com/office/word/2023/wordml/word16du" xmlns:w16sdtdh="http://schemas.microsoft.com/office/word/2020/wordml/sdtdatahash" xmlns:w16sdtfl="http://schemas.microsoft.com/office/word/2024/wordml/sdtformatlock" xmlns:w16se="http://schemas.microsoft.com/office/word/2015/wordml/symex" xmlns:wpg="http://schemas.microsoft.com/office/word/2010/wordprocessingGroup" xmlns:wpi="http://schemas.microsoft.com/office/word/2010/wordprocessingInk" xmlns:wne="http://schemas.microsoft.com/office/word/2006/wordml" xmlns:wps="http://schemas.microsoft.com/office/word/2010/wordprocessingShape" mc:Ignorable="w14 w15 w16se w16cid w16 w16cex w16sdtdh w16sdtfl w16du wp14">
   <w:body>
     <w:p>
       <w:pPr>
@@ -1239,7 +1239,47 @@
           <w:szCs w:val="24"/>
           <w:lang w:bidi="en-US"/>
         </w:rPr>
-        <w:t>The system should be able to connect to all major types of latest versions of relational databases systems such as Oracle, MySQL, Postgre, MSSql and DBF.</w:t>
+        <w:t xml:space="preserve">The system should be able to connect to all major types of latest versions of relational databases systems such as Oracle, MySQL, </w:t>
+      </w:r>
+      <w:proofErr w:type="spellStart"/>
+      <w:r>
+        <w:rPr>
+          <w:rFonts w:asciiTheme="minorHAnsi" w:hAnsiTheme="minorHAnsi" w:cstheme="minorHAnsi"/>
+          <w:sz w:val="24"/>
+          <w:szCs w:val="24"/>
+          <w:lang w:bidi="en-US"/>
+        </w:rPr>
+        <w:t>Postgre</w:t>
+      </w:r>
+      <w:proofErr w:type="spellEnd"/>
+      <w:r>
+        <w:rPr>
+          <w:rFonts w:asciiTheme="minorHAnsi" w:hAnsiTheme="minorHAnsi" w:cstheme="minorHAnsi"/>
+          <w:sz w:val="24"/>
+          <w:szCs w:val="24"/>
+          <w:lang w:bidi="en-US"/>
+        </w:rPr>
+        <w:t xml:space="preserve">, </w:t>
+      </w:r>
+      <w:proofErr w:type="spellStart"/>
+      <w:r>
+        <w:rPr>
+          <w:rFonts w:asciiTheme="minorHAnsi" w:hAnsiTheme="minorHAnsi" w:cstheme="minorHAnsi"/>
+          <w:sz w:val="24"/>
+          <w:szCs w:val="24"/>
+          <w:lang w:bidi="en-US"/>
+        </w:rPr>
+        <w:t>MSSql</w:t>
+      </w:r>
+      <w:proofErr w:type="spellEnd"/>
+      <w:r>
+        <w:rPr>
+          <w:rFonts w:asciiTheme="minorHAnsi" w:hAnsiTheme="minorHAnsi" w:cstheme="minorHAnsi"/>
+          <w:sz w:val="24"/>
+          <w:szCs w:val="24"/>
+          <w:lang w:bidi="en-US"/>
+        </w:rPr>
+        <w:t xml:space="preserve"> and DBF.</w:t>
       </w:r>
     </w:p>
     <w:p>
@@ -1294,7 +1334,27 @@
           <w:lang w:bidi="en-US"/>
         </w:rPr>
         <w:lastRenderedPageBreak/>
-        <w:t>The system must have a Secure Socket Layer (ssl)</w:t>
+        <w:t>The system must have a Secure Socket Layer (</w:t>
+      </w:r>
+      <w:proofErr w:type="spellStart"/>
+      <w:r>
+        <w:rPr>
+          <w:rFonts w:asciiTheme="minorHAnsi" w:hAnsiTheme="minorHAnsi" w:cstheme="minorHAnsi"/>
+          <w:sz w:val="24"/>
+          <w:szCs w:val="24"/>
+          <w:lang w:bidi="en-US"/>
+        </w:rPr>
+        <w:t>ssl</w:t>
+      </w:r>
+      <w:proofErr w:type="spellEnd"/>
+      <w:r>
+        <w:rPr>
+          <w:rFonts w:asciiTheme="minorHAnsi" w:hAnsiTheme="minorHAnsi" w:cstheme="minorHAnsi"/>
+          <w:sz w:val="24"/>
+          <w:szCs w:val="24"/>
+          <w:lang w:bidi="en-US"/>
+        </w:rPr>
+        <w:t>)</w:t>
       </w:r>
     </w:p>
     <w:p>
@@ -3323,7 +3383,23 @@
           <w:rFonts w:asciiTheme="minorHAnsi" w:hAnsiTheme="minorHAnsi" w:cstheme="minorHAnsi"/>
           <w:szCs w:val="24"/>
         </w:rPr>
-        <w:t xml:space="preserve">) and other government agencies (i.e. CSC, DBM, GSIS, Philhealth, Pag-IBIG, SSS, BIR). The forms may be modified/added in the system based on any updates from </w:t>
+        <w:t xml:space="preserve">) and other government agencies (i.e. CSC, DBM, GSIS, </w:t>
+      </w:r>
+      <w:proofErr w:type="spellStart"/>
+      <w:r>
+        <w:rPr>
+          <w:rFonts w:asciiTheme="minorHAnsi" w:hAnsiTheme="minorHAnsi" w:cstheme="minorHAnsi"/>
+          <w:szCs w:val="24"/>
+        </w:rPr>
+        <w:t>Philhealth</w:t>
+      </w:r>
+      <w:proofErr w:type="spellEnd"/>
+      <w:r>
+        <w:rPr>
+          <w:rFonts w:asciiTheme="minorHAnsi" w:hAnsiTheme="minorHAnsi" w:cstheme="minorHAnsi"/>
+          <w:szCs w:val="24"/>
+        </w:rPr>
+        <w:t xml:space="preserve">, Pag-IBIG, SSS, BIR). The forms may be modified/added in the system based on any updates from </w:t>
       </w:r>
       <w:r>
         <w:rPr>
@@ -3358,12 +3434,14 @@
           <w:rFonts w:asciiTheme="minorHAnsi" w:hAnsiTheme="minorHAnsi" w:cstheme="minorHAnsi"/>
           <w:bCs/>
           <w:szCs w:val="24"/>
-        </w:rPr>
-      </w:pPr>
-      <w:r>
-        <w:rPr>
-          <w:rFonts w:asciiTheme="minorHAnsi" w:hAnsiTheme="minorHAnsi" w:cstheme="minorHAnsi"/>
-          <w:szCs w:val="24"/>
+          <w:highlight w:val="yellow"/>
+        </w:rPr>
+      </w:pPr>
+      <w:r>
+        <w:rPr>
+          <w:rFonts w:asciiTheme="minorHAnsi" w:hAnsiTheme="minorHAnsi" w:cstheme="minorHAnsi"/>
+          <w:szCs w:val="24"/>
+          <w:highlight w:val="yellow"/>
         </w:rPr>
         <w:t>Personal Data Sheet;</w:t>
       </w:r>
@@ -3386,12 +3464,14 @@
           <w:rFonts w:asciiTheme="minorHAnsi" w:hAnsiTheme="minorHAnsi" w:cstheme="minorHAnsi"/>
           <w:bCs/>
           <w:szCs w:val="24"/>
-        </w:rPr>
-      </w:pPr>
-      <w:r>
-        <w:rPr>
-          <w:rFonts w:asciiTheme="minorHAnsi" w:hAnsiTheme="minorHAnsi" w:cstheme="minorHAnsi"/>
-          <w:szCs w:val="24"/>
+          <w:highlight w:val="yellow"/>
+        </w:rPr>
+      </w:pPr>
+      <w:r>
+        <w:rPr>
+          <w:rFonts w:asciiTheme="minorHAnsi" w:hAnsiTheme="minorHAnsi" w:cstheme="minorHAnsi"/>
+          <w:szCs w:val="24"/>
+          <w:highlight w:val="yellow"/>
         </w:rPr>
         <w:t>Application for Leave of Absence;</w:t>
       </w:r>
@@ -3449,7 +3529,23 @@
           <w:rFonts w:asciiTheme="minorHAnsi" w:hAnsiTheme="minorHAnsi" w:cstheme="minorHAnsi"/>
           <w:szCs w:val="24"/>
         </w:rPr>
-        <w:t>Statement of Assets, Liabilities and Networth (SALN);</w:t>
+        <w:t xml:space="preserve">Statement of Assets, Liabilities and </w:t>
+      </w:r>
+      <w:proofErr w:type="spellStart"/>
+      <w:r>
+        <w:rPr>
+          <w:rFonts w:asciiTheme="minorHAnsi" w:hAnsiTheme="minorHAnsi" w:cstheme="minorHAnsi"/>
+          <w:szCs w:val="24"/>
+        </w:rPr>
+        <w:t>Networth</w:t>
+      </w:r>
+      <w:proofErr w:type="spellEnd"/>
+      <w:r>
+        <w:rPr>
+          <w:rFonts w:asciiTheme="minorHAnsi" w:hAnsiTheme="minorHAnsi" w:cstheme="minorHAnsi"/>
+          <w:szCs w:val="24"/>
+        </w:rPr>
+        <w:t xml:space="preserve"> (SALN);</w:t>
       </w:r>
     </w:p>
     <w:p>
@@ -5363,7 +5459,23 @@
           <w:rFonts w:asciiTheme="minorHAnsi" w:hAnsiTheme="minorHAnsi" w:cstheme="minorHAnsi"/>
           <w:szCs w:val="24"/>
         </w:rPr>
-        <w:t>Automatic monitoring of days/ leave without pay as well as tardiness and undertime of personnel based on DTR, employee schedule and leave balance records, for purposes of salary deduction.</w:t>
+        <w:t xml:space="preserve">Automatic monitoring of days/ leave without </w:t>
+      </w:r>
+      <w:proofErr w:type="gramStart"/>
+      <w:r>
+        <w:rPr>
+          <w:rFonts w:asciiTheme="minorHAnsi" w:hAnsiTheme="minorHAnsi" w:cstheme="minorHAnsi"/>
+          <w:szCs w:val="24"/>
+        </w:rPr>
+        <w:t>pay</w:t>
+      </w:r>
+      <w:proofErr w:type="gramEnd"/>
+      <w:r>
+        <w:rPr>
+          <w:rFonts w:asciiTheme="minorHAnsi" w:hAnsiTheme="minorHAnsi" w:cstheme="minorHAnsi"/>
+          <w:szCs w:val="24"/>
+        </w:rPr>
+        <w:t xml:space="preserve"> as well as tardiness and undertime of personnel based on DTR, employee schedule and leave balance records, for purposes of salary deduction.</w:t>
       </w:r>
     </w:p>
     <w:p>
@@ -5792,7 +5904,25 @@
           <w:szCs w:val="24"/>
           <w:lang w:bidi="en-US"/>
         </w:rPr>
-        <w:t>Record of Forced Leave Availment of Employees;</w:t>
+        <w:t xml:space="preserve">Record of Forced Leave </w:t>
+      </w:r>
+      <w:proofErr w:type="spellStart"/>
+      <w:r>
+        <w:rPr>
+          <w:rFonts w:asciiTheme="minorHAnsi" w:hAnsiTheme="minorHAnsi" w:cstheme="minorHAnsi"/>
+          <w:szCs w:val="24"/>
+          <w:lang w:bidi="en-US"/>
+        </w:rPr>
+        <w:t>Availment</w:t>
+      </w:r>
+      <w:proofErr w:type="spellEnd"/>
+      <w:r>
+        <w:rPr>
+          <w:rFonts w:asciiTheme="minorHAnsi" w:hAnsiTheme="minorHAnsi" w:cstheme="minorHAnsi"/>
+          <w:szCs w:val="24"/>
+          <w:lang w:bidi="en-US"/>
+        </w:rPr>
+        <w:t xml:space="preserve"> of Employees;</w:t>
       </w:r>
     </w:p>
     <w:p>
@@ -6212,7 +6342,23 @@
           <w:rFonts w:asciiTheme="minorHAnsi" w:hAnsiTheme="minorHAnsi" w:cstheme="minorHAnsi"/>
           <w:szCs w:val="24"/>
         </w:rPr>
-        <w:t>ions (e.g application for leave</w:t>
+        <w:t>ions (</w:t>
+      </w:r>
+      <w:proofErr w:type="spellStart"/>
+      <w:r>
+        <w:rPr>
+          <w:rFonts w:asciiTheme="minorHAnsi" w:hAnsiTheme="minorHAnsi" w:cstheme="minorHAnsi"/>
+          <w:szCs w:val="24"/>
+        </w:rPr>
+        <w:t>e.g</w:t>
+      </w:r>
+      <w:proofErr w:type="spellEnd"/>
+      <w:r>
+        <w:rPr>
+          <w:rFonts w:asciiTheme="minorHAnsi" w:hAnsiTheme="minorHAnsi" w:cstheme="minorHAnsi"/>
+          <w:szCs w:val="24"/>
+        </w:rPr>
+        <w:t xml:space="preserve"> application for leave</w:t>
       </w:r>
       <w:r>
         <w:rPr>
@@ -7931,8 +8077,6 @@
           <w:szCs w:val="24"/>
         </w:rPr>
       </w:pPr>
-      <w:bookmarkStart w:id="0" w:name="_GoBack"/>
-      <w:bookmarkEnd w:id="0"/>
     </w:p>
     <w:p>
       <w:pPr>
@@ -9363,7 +9507,7 @@
           <w:szCs w:val="24"/>
         </w:rPr>
         <w:pict w14:anchorId="2519619D">
-          <v:rect id="_x0000_i1029" style="width:0;height:1.5pt" o:hralign="center" o:hrstd="t" o:hr="t" fillcolor="#a0a0a0" stroked="f"/>
+          <v:rect id="_x0000_i1028" style="width:0;height:1.5pt" o:hralign="center" o:hrstd="t" o:hr="t" fillcolor="#a0a0a0" stroked="f"/>
         </w:pict>
       </w:r>
     </w:p>
@@ -9381,7 +9525,7 @@
 </file>
 
 <file path=word/endnotes.xml><?xml version="1.0" encoding="utf-8"?>
-<w:endnotes xmlns:wpc="http://schemas.microsoft.com/office/word/2010/wordprocessingCanvas" xmlns:cx="http://schemas.microsoft.com/office/drawing/2014/chartex" xmlns:mc="http://schemas.openxmlformats.org/markup-compatibility/2006" xmlns:o="urn:schemas-microsoft-com:office:office" xmlns:r="http://schemas.openxmlformats.org/officeDocument/2006/relationships" xmlns:m="http://schemas.openxmlformats.org/officeDocument/2006/math" xmlns:v="urn:schemas-microsoft-com:vml" xmlns:wp14="http://schemas.microsoft.com/office/word/2010/wordprocessingDrawing" xmlns:wp="http://schemas.openxmlformats.org/drawingml/2006/wordprocessingDrawing" xmlns:w10="urn:schemas-microsoft-com:office:word" xmlns:w="http://schemas.openxmlformats.org/wordprocessingml/2006/main" xmlns:w14="http://schemas.microsoft.com/office/word/2010/wordml" xmlns:w15="http://schemas.microsoft.com/office/word/2012/wordml" xmlns:w16se="http://schemas.microsoft.com/office/word/2015/wordml/symex" xmlns:wpg="http://schemas.microsoft.com/office/word/2010/wordprocessingGroup" xmlns:wpi="http://schemas.microsoft.com/office/word/2010/wordprocessingInk" xmlns:wne="http://schemas.microsoft.com/office/word/2006/wordml" xmlns:wps="http://schemas.microsoft.com/office/word/2010/wordprocessingShape" mc:Ignorable="w14 w15 w16se wp14">
+<w:endnotes xmlns:wpc="http://schemas.microsoft.com/office/word/2010/wordprocessingCanvas" xmlns:cx="http://schemas.microsoft.com/office/drawing/2014/chartex" xmlns:cx1="http://schemas.microsoft.com/office/drawing/2015/9/8/chartex" xmlns:cx2="http://schemas.microsoft.com/office/drawing/2015/10/21/chartex" xmlns:cx3="http://schemas.microsoft.com/office/drawing/2016/5/9/chartex" xmlns:cx4="http://schemas.microsoft.com/office/drawing/2016/5/10/chartex" xmlns:cx5="http://schemas.microsoft.com/office/drawing/2016/5/11/chartex" xmlns:cx6="http://schemas.microsoft.com/office/drawing/2016/5/12/chartex" xmlns:cx7="http://schemas.microsoft.com/office/drawing/2016/5/13/chartex" xmlns:cx8="http://schemas.microsoft.com/office/drawing/2016/5/14/chartex" xmlns:mc="http://schemas.openxmlformats.org/markup-compatibility/2006" xmlns:aink="http://schemas.microsoft.com/office/drawing/2016/ink" xmlns:am3d="http://schemas.microsoft.com/office/drawing/2017/model3d" xmlns:o="urn:schemas-microsoft-com:office:office" xmlns:oel="http://schemas.microsoft.com/office/2019/extlst" xmlns:r="http://schemas.openxmlformats.org/officeDocument/2006/relationships" xmlns:m="http://schemas.openxmlformats.org/officeDocument/2006/math" xmlns:v="urn:schemas-microsoft-com:vml" xmlns:wp14="http://schemas.microsoft.com/office/word/2010/wordprocessingDrawing" xmlns:wp="http://schemas.openxmlformats.org/drawingml/2006/wordprocessingDrawing" xmlns:w10="urn:schemas-microsoft-com:office:word" xmlns:w="http://schemas.openxmlformats.org/wordprocessingml/2006/main" xmlns:w14="http://schemas.microsoft.com/office/word/2010/wordml" xmlns:w15="http://schemas.microsoft.com/office/word/2012/wordml" xmlns:w16cex="http://schemas.microsoft.com/office/word/2018/wordml/cex" xmlns:w16cid="http://schemas.microsoft.com/office/word/2016/wordml/cid" xmlns:w16="http://schemas.microsoft.com/office/word/2018/wordml" xmlns:w16du="http://schemas.microsoft.com/office/word/2023/wordml/word16du" xmlns:w16sdtdh="http://schemas.microsoft.com/office/word/2020/wordml/sdtdatahash" xmlns:w16sdtfl="http://schemas.microsoft.com/office/word/2024/wordml/sdtformatlock" xmlns:w16se="http://schemas.microsoft.com/office/word/2015/wordml/symex" xmlns:wpg="http://schemas.microsoft.com/office/word/2010/wordprocessingGroup" xmlns:wpi="http://schemas.microsoft.com/office/word/2010/wordprocessingInk" xmlns:wne="http://schemas.microsoft.com/office/word/2006/wordml" xmlns:wps="http://schemas.microsoft.com/office/word/2010/wordprocessingShape" mc:Ignorable="w14 w15 w16se w16cid w16 w16cex w16sdtdh w16sdtfl w16du wp14">
   <w:endnote w:type="separator" w:id="-1">
     <w:p>
       <w:pPr>
@@ -9406,7 +9550,7 @@
 </file>
 
 <file path=word/footnotes.xml><?xml version="1.0" encoding="utf-8"?>
-<w:footnotes xmlns:wpc="http://schemas.microsoft.com/office/word/2010/wordprocessingCanvas" xmlns:cx="http://schemas.microsoft.com/office/drawing/2014/chartex" xmlns:mc="http://schemas.openxmlformats.org/markup-compatibility/2006" xmlns:o="urn:schemas-microsoft-com:office:office" xmlns:r="http://schemas.openxmlformats.org/officeDocument/2006/relationships" xmlns:m="http://schemas.openxmlformats.org/officeDocument/2006/math" xmlns:v="urn:schemas-microsoft-com:vml" xmlns:wp14="http://schemas.microsoft.com/office/word/2010/wordprocessingDrawing" xmlns:wp="http://schemas.openxmlformats.org/drawingml/2006/wordprocessingDrawing" xmlns:w10="urn:schemas-microsoft-com:office:word" xmlns:w="http://schemas.openxmlformats.org/wordprocessingml/2006/main" xmlns:w14="http://schemas.microsoft.com/office/word/2010/wordml" xmlns:w15="http://schemas.microsoft.com/office/word/2012/wordml" xmlns:w16se="http://schemas.microsoft.com/office/word/2015/wordml/symex" xmlns:wpg="http://schemas.microsoft.com/office/word/2010/wordprocessingGroup" xmlns:wpi="http://schemas.microsoft.com/office/word/2010/wordprocessingInk" xmlns:wne="http://schemas.microsoft.com/office/word/2006/wordml" xmlns:wps="http://schemas.microsoft.com/office/word/2010/wordprocessingShape" mc:Ignorable="w14 w15 w16se wp14">
+<w:footnotes xmlns:wpc="http://schemas.microsoft.com/office/word/2010/wordprocessingCanvas" xmlns:cx="http://schemas.microsoft.com/office/drawing/2014/chartex" xmlns:cx1="http://schemas.microsoft.com/office/drawing/2015/9/8/chartex" xmlns:cx2="http://schemas.microsoft.com/office/drawing/2015/10/21/chartex" xmlns:cx3="http://schemas.microsoft.com/office/drawing/2016/5/9/chartex" xmlns:cx4="http://schemas.microsoft.com/office/drawing/2016/5/10/chartex" xmlns:cx5="http://schemas.microsoft.com/office/drawing/2016/5/11/chartex" xmlns:cx6="http://schemas.microsoft.com/office/drawing/2016/5/12/chartex" xmlns:cx7="http://schemas.microsoft.com/office/drawing/2016/5/13/chartex" xmlns:cx8="http://schemas.microsoft.com/office/drawing/2016/5/14/chartex" xmlns:mc="http://schemas.openxmlformats.org/markup-compatibility/2006" xmlns:aink="http://schemas.microsoft.com/office/drawing/2016/ink" xmlns:am3d="http://schemas.microsoft.com/office/drawing/2017/model3d" xmlns:o="urn:schemas-microsoft-com:office:office" xmlns:oel="http://schemas.microsoft.com/office/2019/extlst" xmlns:r="http://schemas.openxmlformats.org/officeDocument/2006/relationships" xmlns:m="http://schemas.openxmlformats.org/officeDocument/2006/math" xmlns:v="urn:schemas-microsoft-com:vml" xmlns:wp14="http://schemas.microsoft.com/office/word/2010/wordprocessingDrawing" xmlns:wp="http://schemas.openxmlformats.org/drawingml/2006/wordprocessingDrawing" xmlns:w10="urn:schemas-microsoft-com:office:word" xmlns:w="http://schemas.openxmlformats.org/wordprocessingml/2006/main" xmlns:w14="http://schemas.microsoft.com/office/word/2010/wordml" xmlns:w15="http://schemas.microsoft.com/office/word/2012/wordml" xmlns:w16cex="http://schemas.microsoft.com/office/word/2018/wordml/cex" xmlns:w16cid="http://schemas.microsoft.com/office/word/2016/wordml/cid" xmlns:w16="http://schemas.microsoft.com/office/word/2018/wordml" xmlns:w16du="http://schemas.microsoft.com/office/word/2023/wordml/word16du" xmlns:w16sdtdh="http://schemas.microsoft.com/office/word/2020/wordml/sdtdatahash" xmlns:w16sdtfl="http://schemas.microsoft.com/office/word/2024/wordml/sdtformatlock" xmlns:w16se="http://schemas.microsoft.com/office/word/2015/wordml/symex" xmlns:wpg="http://schemas.microsoft.com/office/word/2010/wordprocessingGroup" xmlns:wpi="http://schemas.microsoft.com/office/word/2010/wordprocessingInk" xmlns:wne="http://schemas.microsoft.com/office/word/2006/wordml" xmlns:wps="http://schemas.microsoft.com/office/word/2010/wordprocessingShape" mc:Ignorable="w14 w15 w16se w16cid w16 w16cex w16sdtdh w16sdtfl w16du wp14">
   <w:footnote w:type="separator" w:id="-1">
     <w:p>
       <w:pPr>
@@ -9431,7 +9575,7 @@
 </file>
 
 <file path=word/numbering.xml><?xml version="1.0" encoding="utf-8"?>
-<w:numbering xmlns:wpc="http://schemas.microsoft.com/office/word/2010/wordprocessingCanvas" xmlns:cx="http://schemas.microsoft.com/office/drawing/2014/chartex" xmlns:mc="http://schemas.openxmlformats.org/markup-compatibility/2006" xmlns:o="urn:schemas-microsoft-com:office:office" xmlns:r="http://schemas.openxmlformats.org/officeDocument/2006/relationships" xmlns:m="http://schemas.openxmlformats.org/officeDocument/2006/math" xmlns:v="urn:schemas-microsoft-com:vml" xmlns:wp14="http://schemas.microsoft.com/office/word/2010/wordprocessingDrawing" xmlns:wp="http://schemas.openxmlformats.org/drawingml/2006/wordprocessingDrawing" xmlns:w10="urn:schemas-microsoft-com:office:word" xmlns:w="http://schemas.openxmlformats.org/wordprocessingml/2006/main" xmlns:w14="http://schemas.microsoft.com/office/word/2010/wordml" xmlns:w15="http://schemas.microsoft.com/office/word/2012/wordml" xmlns:w16se="http://schemas.microsoft.com/office/word/2015/wordml/symex" xmlns:wpg="http://schemas.microsoft.com/office/word/2010/wordprocessingGroup" xmlns:wpi="http://schemas.microsoft.com/office/word/2010/wordprocessingInk" xmlns:wne="http://schemas.microsoft.com/office/word/2006/wordml" xmlns:wps="http://schemas.microsoft.com/office/word/2010/wordprocessingShape" mc:Ignorable="w14 w15 w16se wp14">
+<w:numbering xmlns:wpc="http://schemas.microsoft.com/office/word/2010/wordprocessingCanvas" xmlns:cx="http://schemas.microsoft.com/office/drawing/2014/chartex" xmlns:cx1="http://schemas.microsoft.com/office/drawing/2015/9/8/chartex" xmlns:cx2="http://schemas.microsoft.com/office/drawing/2015/10/21/chartex" xmlns:cx3="http://schemas.microsoft.com/office/drawing/2016/5/9/chartex" xmlns:cx4="http://schemas.microsoft.com/office/drawing/2016/5/10/chartex" xmlns:cx5="http://schemas.microsoft.com/office/drawing/2016/5/11/chartex" xmlns:cx6="http://schemas.microsoft.com/office/drawing/2016/5/12/chartex" xmlns:cx7="http://schemas.microsoft.com/office/drawing/2016/5/13/chartex" xmlns:cx8="http://schemas.microsoft.com/office/drawing/2016/5/14/chartex" xmlns:mc="http://schemas.openxmlformats.org/markup-compatibility/2006" xmlns:aink="http://schemas.microsoft.com/office/drawing/2016/ink" xmlns:am3d="http://schemas.microsoft.com/office/drawing/2017/model3d" xmlns:o="urn:schemas-microsoft-com:office:office" xmlns:oel="http://schemas.microsoft.com/office/2019/extlst" xmlns:r="http://schemas.openxmlformats.org/officeDocument/2006/relationships" xmlns:m="http://schemas.openxmlformats.org/officeDocument/2006/math" xmlns:v="urn:schemas-microsoft-com:vml" xmlns:wp14="http://schemas.microsoft.com/office/word/2010/wordprocessingDrawing" xmlns:wp="http://schemas.openxmlformats.org/drawingml/2006/wordprocessingDrawing" xmlns:w10="urn:schemas-microsoft-com:office:word" xmlns:w="http://schemas.openxmlformats.org/wordprocessingml/2006/main" xmlns:w14="http://schemas.microsoft.com/office/word/2010/wordml" xmlns:w15="http://schemas.microsoft.com/office/word/2012/wordml" xmlns:w16cex="http://schemas.microsoft.com/office/word/2018/wordml/cex" xmlns:w16cid="http://schemas.microsoft.com/office/word/2016/wordml/cid" xmlns:w16="http://schemas.microsoft.com/office/word/2018/wordml" xmlns:w16du="http://schemas.microsoft.com/office/word/2023/wordml/word16du" xmlns:w16sdtdh="http://schemas.microsoft.com/office/word/2020/wordml/sdtdatahash" xmlns:w16sdtfl="http://schemas.microsoft.com/office/word/2024/wordml/sdtformatlock" xmlns:w16se="http://schemas.microsoft.com/office/word/2015/wordml/symex" xmlns:wpg="http://schemas.microsoft.com/office/word/2010/wordprocessingGroup" xmlns:wpi="http://schemas.microsoft.com/office/word/2010/wordprocessingInk" xmlns:wne="http://schemas.microsoft.com/office/word/2006/wordml" xmlns:wps="http://schemas.microsoft.com/office/word/2010/wordprocessingShape" mc:Ignorable="w14 w15 w16se w16cid w16 w16cex w16sdtdh w16sdtfl w16du wp14">
   <w:abstractNum w:abstractNumId="0" w15:restartNumberingAfterBreak="0">
     <w:nsid w:val="00880158"/>
     <w:multiLevelType w:val="multilevel"/>
@@ -13906,125 +14050,125 @@
       </w:rPr>
     </w:lvl>
   </w:abstractNum>
-  <w:num w:numId="1">
+  <w:num w:numId="1" w16cid:durableId="499464217">
     <w:abstractNumId w:val="14"/>
   </w:num>
-  <w:num w:numId="2">
+  <w:num w:numId="2" w16cid:durableId="191580224">
     <w:abstractNumId w:val="11"/>
   </w:num>
-  <w:num w:numId="3">
+  <w:num w:numId="3" w16cid:durableId="577784010">
     <w:abstractNumId w:val="28"/>
   </w:num>
-  <w:num w:numId="4">
+  <w:num w:numId="4" w16cid:durableId="1985235358">
     <w:abstractNumId w:val="7"/>
   </w:num>
-  <w:num w:numId="5">
+  <w:num w:numId="5" w16cid:durableId="797648971">
     <w:abstractNumId w:val="0"/>
   </w:num>
-  <w:num w:numId="6">
+  <w:num w:numId="6" w16cid:durableId="173502369">
     <w:abstractNumId w:val="22"/>
   </w:num>
-  <w:num w:numId="7">
+  <w:num w:numId="7" w16cid:durableId="2058120182">
     <w:abstractNumId w:val="21"/>
   </w:num>
-  <w:num w:numId="8">
+  <w:num w:numId="8" w16cid:durableId="346062209">
     <w:abstractNumId w:val="16"/>
   </w:num>
-  <w:num w:numId="9">
+  <w:num w:numId="9" w16cid:durableId="483007360">
     <w:abstractNumId w:val="29"/>
   </w:num>
-  <w:num w:numId="10">
+  <w:num w:numId="10" w16cid:durableId="410811270">
     <w:abstractNumId w:val="1"/>
   </w:num>
-  <w:num w:numId="11">
+  <w:num w:numId="11" w16cid:durableId="38013803">
     <w:abstractNumId w:val="19"/>
   </w:num>
-  <w:num w:numId="12">
+  <w:num w:numId="12" w16cid:durableId="135415368">
     <w:abstractNumId w:val="27"/>
   </w:num>
-  <w:num w:numId="13">
+  <w:num w:numId="13" w16cid:durableId="1888490053">
     <w:abstractNumId w:val="25"/>
   </w:num>
-  <w:num w:numId="14">
+  <w:num w:numId="14" w16cid:durableId="1338769546">
     <w:abstractNumId w:val="8"/>
   </w:num>
-  <w:num w:numId="15">
+  <w:num w:numId="15" w16cid:durableId="208878650">
     <w:abstractNumId w:val="36"/>
   </w:num>
-  <w:num w:numId="16">
+  <w:num w:numId="16" w16cid:durableId="1076048573">
     <w:abstractNumId w:val="30"/>
   </w:num>
-  <w:num w:numId="17">
+  <w:num w:numId="17" w16cid:durableId="1927113425">
     <w:abstractNumId w:val="35"/>
   </w:num>
-  <w:num w:numId="18">
+  <w:num w:numId="18" w16cid:durableId="2070490527">
     <w:abstractNumId w:val="12"/>
   </w:num>
-  <w:num w:numId="19">
+  <w:num w:numId="19" w16cid:durableId="1146704919">
     <w:abstractNumId w:val="15"/>
   </w:num>
-  <w:num w:numId="20">
+  <w:num w:numId="20" w16cid:durableId="302202183">
     <w:abstractNumId w:val="23"/>
   </w:num>
-  <w:num w:numId="21">
+  <w:num w:numId="21" w16cid:durableId="1725060807">
     <w:abstractNumId w:val="33"/>
   </w:num>
-  <w:num w:numId="22">
+  <w:num w:numId="22" w16cid:durableId="532577653">
     <w:abstractNumId w:val="13"/>
   </w:num>
-  <w:num w:numId="23">
+  <w:num w:numId="23" w16cid:durableId="1436704310">
     <w:abstractNumId w:val="24"/>
   </w:num>
-  <w:num w:numId="24">
+  <w:num w:numId="24" w16cid:durableId="395670052">
     <w:abstractNumId w:val="3"/>
   </w:num>
-  <w:num w:numId="25">
+  <w:num w:numId="25" w16cid:durableId="1775708667">
     <w:abstractNumId w:val="4"/>
   </w:num>
-  <w:num w:numId="26">
+  <w:num w:numId="26" w16cid:durableId="789402686">
     <w:abstractNumId w:val="18"/>
   </w:num>
-  <w:num w:numId="27">
+  <w:num w:numId="27" w16cid:durableId="336886939">
     <w:abstractNumId w:val="5"/>
   </w:num>
-  <w:num w:numId="28">
+  <w:num w:numId="28" w16cid:durableId="1457066240">
     <w:abstractNumId w:val="2"/>
   </w:num>
-  <w:num w:numId="29">
+  <w:num w:numId="29" w16cid:durableId="740716154">
     <w:abstractNumId w:val="17"/>
   </w:num>
-  <w:num w:numId="30">
+  <w:num w:numId="30" w16cid:durableId="1959531374">
     <w:abstractNumId w:val="20"/>
   </w:num>
-  <w:num w:numId="31">
+  <w:num w:numId="31" w16cid:durableId="1510096970">
     <w:abstractNumId w:val="9"/>
   </w:num>
-  <w:num w:numId="32">
+  <w:num w:numId="32" w16cid:durableId="733819620">
     <w:abstractNumId w:val="34"/>
   </w:num>
-  <w:num w:numId="33">
+  <w:num w:numId="33" w16cid:durableId="1889759833">
     <w:abstractNumId w:val="10"/>
   </w:num>
-  <w:num w:numId="34">
+  <w:num w:numId="34" w16cid:durableId="1500778662">
     <w:abstractNumId w:val="32"/>
   </w:num>
-  <w:num w:numId="35">
+  <w:num w:numId="35" w16cid:durableId="1802189004">
     <w:abstractNumId w:val="37"/>
   </w:num>
-  <w:num w:numId="36">
+  <w:num w:numId="36" w16cid:durableId="1345669848">
     <w:abstractNumId w:val="6"/>
   </w:num>
-  <w:num w:numId="37">
+  <w:num w:numId="37" w16cid:durableId="1008215746">
     <w:abstractNumId w:val="26"/>
   </w:num>
-  <w:num w:numId="38">
+  <w:num w:numId="38" w16cid:durableId="1150757581">
     <w:abstractNumId w:val="31"/>
   </w:num>
 </w:numbering>
 </file>
 
 <file path=word/styles.xml><?xml version="1.0" encoding="utf-8"?>
-<w:styles xmlns:mc="http://schemas.openxmlformats.org/markup-compatibility/2006" xmlns:r="http://schemas.openxmlformats.org/officeDocument/2006/relationships" xmlns:w="http://schemas.openxmlformats.org/wordprocessingml/2006/main" xmlns:w14="http://schemas.microsoft.com/office/word/2010/wordml" xmlns:w15="http://schemas.microsoft.com/office/word/2012/wordml" xmlns:w16se="http://schemas.microsoft.com/office/word/2015/wordml/symex" mc:Ignorable="w14 w15 w16se">
+<w:styles xmlns:mc="http://schemas.openxmlformats.org/markup-compatibility/2006" xmlns:r="http://schemas.openxmlformats.org/officeDocument/2006/relationships" xmlns:w="http://schemas.openxmlformats.org/wordprocessingml/2006/main" xmlns:w14="http://schemas.microsoft.com/office/word/2010/wordml" xmlns:w15="http://schemas.microsoft.com/office/word/2012/wordml" xmlns:w16cex="http://schemas.microsoft.com/office/word/2018/wordml/cex" xmlns:w16cid="http://schemas.microsoft.com/office/word/2016/wordml/cid" xmlns:w16="http://schemas.microsoft.com/office/word/2018/wordml" xmlns:w16du="http://schemas.microsoft.com/office/word/2023/wordml/word16du" xmlns:w16sdtdh="http://schemas.microsoft.com/office/word/2020/wordml/sdtdatahash" xmlns:w16sdtfl="http://schemas.microsoft.com/office/word/2024/wordml/sdtformatlock" xmlns:w16se="http://schemas.microsoft.com/office/word/2015/wordml/symex" mc:Ignorable="w14 w15 w16se w16cid w16 w16cex w16sdtdh w16sdtfl w16du">
   <w:docDefaults>
     <w:rPrDefault>
       <w:rPr>
@@ -14042,7 +14186,7 @@
       </w:pPr>
     </w:pPrDefault>
   </w:docDefaults>
-  <w:latentStyles w:defLockedState="0" w:defUIPriority="99" w:defSemiHidden="0" w:defUnhideWhenUsed="0" w:defQFormat="0" w:count="371">
+  <w:latentStyles w:defLockedState="0" w:defUIPriority="99" w:defSemiHidden="0" w:defUnhideWhenUsed="0" w:defQFormat="0" w:count="376">
     <w:lsdException w:name="Normal" w:uiPriority="0" w:qFormat="1"/>
     <w:lsdException w:name="heading 1" w:uiPriority="9" w:qFormat="1"/>
     <w:lsdException w:name="heading 2" w:semiHidden="1" w:uiPriority="9" w:unhideWhenUsed="1" w:qFormat="1"/>
@@ -14414,6 +14558,11 @@
     <w:lsdException w:name="List Table 5 Dark Accent 6" w:uiPriority="50"/>
     <w:lsdException w:name="List Table 6 Colorful Accent 6" w:uiPriority="51"/>
     <w:lsdException w:name="List Table 7 Colorful Accent 6" w:uiPriority="52"/>
+    <w:lsdException w:name="Mention" w:semiHidden="1" w:unhideWhenUsed="1"/>
+    <w:lsdException w:name="Smart Hyperlink" w:semiHidden="1" w:unhideWhenUsed="1"/>
+    <w:lsdException w:name="Hashtag" w:semiHidden="1" w:unhideWhenUsed="1"/>
+    <w:lsdException w:name="Unresolved Mention" w:semiHidden="1" w:unhideWhenUsed="1"/>
+    <w:lsdException w:name="Smart Link" w:semiHidden="1" w:unhideWhenUsed="1"/>
   </w:latentStyles>
   <w:style w:type="paragraph" w:default="1" w:styleId="Normal">
     <w:name w:val="Normal"/>

</xml_diff>